<commit_message>
feat(v3): migrate completely to google ecosystem with firebase auth and firestore
</commit_message>
<xml_diff>
--- a/Requerimientos.docx
+++ b/Requerimientos.docx
@@ -132,13 +132,15 @@
       </w:pPr>
       <w:r>
         <w:rPr>
-          <w:rFonts w:ascii="Times New Roman" w:eastAsia="Times New Roman" w:hAnsi="Times New Roman" w:cs="Times New Roman"/>
           <w:noProof/>
-          <w:kern w:val="0"/>
-          <w:lang w:eastAsia="es-MX"/>
-        </w:rPr>
-        <w:pict w14:anchorId="2A8E1F84">
-          <v:rect id="_x0000_i1035" alt="" style="width:441.9pt;height:.05pt;mso-width-percent:0;mso-height-percent:0;mso-width-percent:0;mso-height-percent:0" o:hralign="center" o:hrstd="t" o:hr="t" fillcolor="#a0a0a0" stroked="f"/>
+        </w:rPr>
+      </w:r>
+      <w:r>
+        <w:pict w14:anchorId="12CA62C5">
+          <v:rect id="Rectángulo 43" o:spid="_x0000_s1036" style="width:441.9pt;height:.05pt;visibility:visible;mso-wrap-style:square;mso-left-percent:-10001;mso-top-percent:-10001;mso-position-horizontal:absolute;mso-position-horizontal-relative:char;mso-position-vertical:absolute;mso-position-vertical-relative:line;mso-left-percent:-10001;mso-top-percent:-10001;v-text-anchor:top" o:gfxdata="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" filled="f">
+            <o:lock v:ext="edit" aspectratio="t"/>
+            <w10:anchorlock/>
+          </v:rect>
         </w:pict>
       </w:r>
     </w:p>
@@ -271,13 +273,15 @@
       </w:pPr>
       <w:r>
         <w:rPr>
-          <w:rFonts w:ascii="Times New Roman" w:eastAsia="Times New Roman" w:hAnsi="Times New Roman" w:cs="Times New Roman"/>
           <w:noProof/>
-          <w:kern w:val="0"/>
-          <w:lang w:eastAsia="es-MX"/>
-        </w:rPr>
-        <w:pict w14:anchorId="3ADBAC20">
-          <v:rect id="_x0000_i1034" alt="" style="width:441.9pt;height:.05pt;mso-width-percent:0;mso-height-percent:0;mso-width-percent:0;mso-height-percent:0" o:hralign="center" o:hrstd="t" o:hr="t" fillcolor="#a0a0a0" stroked="f"/>
+        </w:rPr>
+      </w:r>
+      <w:r>
+        <w:pict w14:anchorId="2F0F0597">
+          <v:rect id="Rectángulo 41" o:spid="_x0000_s1035" style="width:441.9pt;height:.05pt;visibility:visible;mso-wrap-style:square;mso-left-percent:-10001;mso-top-percent:-10001;mso-position-horizontal:absolute;mso-position-horizontal-relative:char;mso-position-vertical:absolute;mso-position-vertical-relative:line;mso-left-percent:-10001;mso-top-percent:-10001;v-text-anchor:top" o:gfxdata="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" filled="f">
+            <o:lock v:ext="edit" aspectratio="t"/>
+            <w10:anchorlock/>
+          </v:rect>
         </w:pict>
       </w:r>
     </w:p>
@@ -592,13 +596,15 @@
       </w:pPr>
       <w:r>
         <w:rPr>
-          <w:rFonts w:ascii="Times New Roman" w:eastAsia="Times New Roman" w:hAnsi="Times New Roman" w:cs="Times New Roman"/>
           <w:noProof/>
-          <w:kern w:val="0"/>
-          <w:lang w:eastAsia="es-MX"/>
-        </w:rPr>
-        <w:pict w14:anchorId="5BC1B134">
-          <v:rect id="_x0000_i1033" alt="" style="width:441.9pt;height:.05pt;mso-width-percent:0;mso-height-percent:0;mso-width-percent:0;mso-height-percent:0" o:hralign="center" o:hrstd="t" o:hr="t" fillcolor="#a0a0a0" stroked="f"/>
+        </w:rPr>
+      </w:r>
+      <w:r>
+        <w:pict w14:anchorId="15C079F5">
+          <v:rect id="Rectángulo 39" o:spid="_x0000_s1034" style="width:441.9pt;height:.05pt;visibility:visible;mso-wrap-style:square;mso-left-percent:-10001;mso-top-percent:-10001;mso-position-horizontal:absolute;mso-position-horizontal-relative:char;mso-position-vertical:absolute;mso-position-vertical-relative:line;mso-left-percent:-10001;mso-top-percent:-10001;v-text-anchor:top" o:gfxdata="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" filled="f">
+            <o:lock v:ext="edit" aspectratio="t"/>
+            <w10:anchorlock/>
+          </v:rect>
         </w:pict>
       </w:r>
     </w:p>
@@ -704,13 +710,15 @@
       </w:pPr>
       <w:r>
         <w:rPr>
-          <w:rFonts w:ascii="Times New Roman" w:eastAsia="Times New Roman" w:hAnsi="Times New Roman" w:cs="Times New Roman"/>
           <w:noProof/>
-          <w:kern w:val="0"/>
-          <w:lang w:eastAsia="es-MX"/>
-        </w:rPr>
-        <w:pict w14:anchorId="670F9CA2">
-          <v:rect id="_x0000_i1032" alt="" style="width:441.9pt;height:.05pt;mso-width-percent:0;mso-height-percent:0;mso-width-percent:0;mso-height-percent:0" o:hralign="center" o:hrstd="t" o:hr="t" fillcolor="#a0a0a0" stroked="f"/>
+        </w:rPr>
+      </w:r>
+      <w:r>
+        <w:pict w14:anchorId="76B6B12D">
+          <v:rect id="Rectángulo 37" o:spid="_x0000_s1033" style="width:441.9pt;height:.05pt;visibility:visible;mso-wrap-style:square;mso-left-percent:-10001;mso-top-percent:-10001;mso-position-horizontal:absolute;mso-position-horizontal-relative:char;mso-position-vertical:absolute;mso-position-vertical-relative:line;mso-left-percent:-10001;mso-top-percent:-10001;v-text-anchor:top" o:gfxdata="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" filled="f">
+            <o:lock v:ext="edit" aspectratio="t"/>
+            <w10:anchorlock/>
+          </v:rect>
         </w:pict>
       </w:r>
     </w:p>
@@ -795,13 +803,15 @@
       </w:pPr>
       <w:r>
         <w:rPr>
-          <w:rFonts w:ascii="Times New Roman" w:eastAsia="Times New Roman" w:hAnsi="Times New Roman" w:cs="Times New Roman"/>
           <w:noProof/>
-          <w:kern w:val="0"/>
-          <w:lang w:eastAsia="es-MX"/>
-        </w:rPr>
-        <w:pict w14:anchorId="4DBF8BA1">
-          <v:rect id="_x0000_i1031" alt="" style="width:441.9pt;height:.05pt;mso-width-percent:0;mso-height-percent:0;mso-width-percent:0;mso-height-percent:0" o:hralign="center" o:hrstd="t" o:hr="t" fillcolor="#a0a0a0" stroked="f"/>
+        </w:rPr>
+      </w:r>
+      <w:r>
+        <w:pict w14:anchorId="4765856D">
+          <v:rect id="Rectángulo 35" o:spid="_x0000_s1032" style="width:441.9pt;height:.05pt;visibility:visible;mso-wrap-style:square;mso-left-percent:-10001;mso-top-percent:-10001;mso-position-horizontal:absolute;mso-position-horizontal-relative:char;mso-position-vertical:absolute;mso-position-vertical-relative:line;mso-left-percent:-10001;mso-top-percent:-10001;v-text-anchor:top" o:gfxdata="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" filled="f">
+            <o:lock v:ext="edit" aspectratio="t"/>
+            <w10:anchorlock/>
+          </v:rect>
         </w:pict>
       </w:r>
     </w:p>
@@ -1084,13 +1094,15 @@
       </w:pPr>
       <w:r>
         <w:rPr>
-          <w:rFonts w:ascii="Times New Roman" w:eastAsia="Times New Roman" w:hAnsi="Times New Roman" w:cs="Times New Roman"/>
           <w:noProof/>
-          <w:kern w:val="0"/>
-          <w:lang w:eastAsia="es-MX"/>
-        </w:rPr>
-        <w:pict w14:anchorId="77FC53BE">
-          <v:rect id="_x0000_i1030" alt="" style="width:441.9pt;height:.05pt;mso-width-percent:0;mso-height-percent:0;mso-width-percent:0;mso-height-percent:0" o:hralign="center" o:hrstd="t" o:hr="t" fillcolor="#a0a0a0" stroked="f"/>
+        </w:rPr>
+      </w:r>
+      <w:r>
+        <w:pict w14:anchorId="6F4D557A">
+          <v:rect id="Rectángulo 33" o:spid="_x0000_s1031" style="width:441.9pt;height:.05pt;visibility:visible;mso-wrap-style:square;mso-left-percent:-10001;mso-top-percent:-10001;mso-position-horizontal:absolute;mso-position-horizontal-relative:char;mso-position-vertical:absolute;mso-position-vertical-relative:line;mso-left-percent:-10001;mso-top-percent:-10001;v-text-anchor:top" o:gfxdata="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" filled="f">
+            <o:lock v:ext="edit" aspectratio="t"/>
+            <w10:anchorlock/>
+          </v:rect>
         </w:pict>
       </w:r>
     </w:p>
@@ -1247,13 +1259,15 @@
       </w:pPr>
       <w:r>
         <w:rPr>
-          <w:rFonts w:ascii="Times New Roman" w:eastAsia="Times New Roman" w:hAnsi="Times New Roman" w:cs="Times New Roman"/>
           <w:noProof/>
-          <w:kern w:val="0"/>
-          <w:lang w:eastAsia="es-MX"/>
-        </w:rPr>
-        <w:pict w14:anchorId="5AC80EF1">
-          <v:rect id="_x0000_i1029" alt="" style="width:441.9pt;height:.05pt;mso-width-percent:0;mso-height-percent:0;mso-width-percent:0;mso-height-percent:0" o:hralign="center" o:hrstd="t" o:hr="t" fillcolor="#a0a0a0" stroked="f"/>
+        </w:rPr>
+      </w:r>
+      <w:r>
+        <w:pict w14:anchorId="2FA47EDC">
+          <v:rect id="Rectángulo 31" o:spid="_x0000_s1030" style="width:441.9pt;height:.05pt;visibility:visible;mso-wrap-style:square;mso-left-percent:-10001;mso-top-percent:-10001;mso-position-horizontal:absolute;mso-position-horizontal-relative:char;mso-position-vertical:absolute;mso-position-vertical-relative:line;mso-left-percent:-10001;mso-top-percent:-10001;v-text-anchor:top" o:gfxdata="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" filled="f">
+            <o:lock v:ext="edit" aspectratio="t"/>
+            <w10:anchorlock/>
+          </v:rect>
         </w:pict>
       </w:r>
     </w:p>
@@ -1387,13 +1401,15 @@
       </w:pPr>
       <w:r>
         <w:rPr>
-          <w:rFonts w:ascii="Times New Roman" w:eastAsia="Times New Roman" w:hAnsi="Times New Roman" w:cs="Times New Roman"/>
           <w:noProof/>
-          <w:kern w:val="0"/>
-          <w:lang w:eastAsia="es-MX"/>
-        </w:rPr>
-        <w:pict w14:anchorId="02ED735B">
-          <v:rect id="_x0000_i1028" alt="" style="width:441.9pt;height:.05pt;mso-width-percent:0;mso-height-percent:0;mso-width-percent:0;mso-height-percent:0" o:hralign="center" o:hrstd="t" o:hr="t" fillcolor="#a0a0a0" stroked="f"/>
+        </w:rPr>
+      </w:r>
+      <w:r>
+        <w:pict w14:anchorId="1F369495">
+          <v:rect id="Rectángulo 29" o:spid="_x0000_s1029" style="width:441.9pt;height:.05pt;visibility:visible;mso-wrap-style:square;mso-left-percent:-10001;mso-top-percent:-10001;mso-position-horizontal:absolute;mso-position-horizontal-relative:char;mso-position-vertical:absolute;mso-position-vertical-relative:line;mso-left-percent:-10001;mso-top-percent:-10001;v-text-anchor:top" o:gfxdata="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" filled="f">
+            <o:lock v:ext="edit" aspectratio="t"/>
+            <w10:anchorlock/>
+          </v:rect>
         </w:pict>
       </w:r>
     </w:p>
@@ -1784,13 +1800,15 @@
       </w:pPr>
       <w:r>
         <w:rPr>
-          <w:rFonts w:ascii="Times New Roman" w:eastAsia="Times New Roman" w:hAnsi="Times New Roman" w:cs="Times New Roman"/>
           <w:noProof/>
-          <w:kern w:val="0"/>
-          <w:lang w:eastAsia="es-MX"/>
-        </w:rPr>
-        <w:pict w14:anchorId="03ADFB15">
-          <v:rect id="_x0000_i1027" alt="" style="width:441.9pt;height:.05pt;mso-width-percent:0;mso-height-percent:0;mso-width-percent:0;mso-height-percent:0" o:hralign="center" o:hrstd="t" o:hr="t" fillcolor="#a0a0a0" stroked="f"/>
+        </w:rPr>
+      </w:r>
+      <w:r>
+        <w:pict w14:anchorId="025A4885">
+          <v:rect id="Rectángulo 27" o:spid="_x0000_s1028" style="width:441.9pt;height:.05pt;visibility:visible;mso-wrap-style:square;mso-left-percent:-10001;mso-top-percent:-10001;mso-position-horizontal:absolute;mso-position-horizontal-relative:char;mso-position-vertical:absolute;mso-position-vertical-relative:line;mso-left-percent:-10001;mso-top-percent:-10001;v-text-anchor:top" o:gfxdata="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" filled="f">
+            <o:lock v:ext="edit" aspectratio="t"/>
+            <w10:anchorlock/>
+          </v:rect>
         </w:pict>
       </w:r>
     </w:p>
@@ -1931,13 +1949,15 @@
       </w:pPr>
       <w:r>
         <w:rPr>
-          <w:rFonts w:ascii="Times New Roman" w:eastAsia="Times New Roman" w:hAnsi="Times New Roman" w:cs="Times New Roman"/>
           <w:noProof/>
-          <w:kern w:val="0"/>
-          <w:lang w:eastAsia="es-MX"/>
-        </w:rPr>
-        <w:pict w14:anchorId="57183086">
-          <v:rect id="_x0000_i1026" alt="" style="width:441.9pt;height:.05pt;mso-width-percent:0;mso-height-percent:0;mso-width-percent:0;mso-height-percent:0" o:hralign="center" o:hrstd="t" o:hr="t" fillcolor="#a0a0a0" stroked="f"/>
+        </w:rPr>
+      </w:r>
+      <w:r>
+        <w:pict w14:anchorId="185445B9">
+          <v:rect id="Rectángulo 25" o:spid="_x0000_s1027" style="width:441.9pt;height:.05pt;visibility:visible;mso-wrap-style:square;mso-left-percent:-10001;mso-top-percent:-10001;mso-position-horizontal:absolute;mso-position-horizontal-relative:char;mso-position-vertical:absolute;mso-position-vertical-relative:line;mso-left-percent:-10001;mso-top-percent:-10001;v-text-anchor:top" o:gfxdata="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" filled="f">
+            <o:lock v:ext="edit" aspectratio="t"/>
+            <w10:anchorlock/>
+          </v:rect>
         </w:pict>
       </w:r>
     </w:p>
@@ -2147,13 +2167,15 @@
       </w:pPr>
       <w:r>
         <w:rPr>
-          <w:rFonts w:ascii="Times New Roman" w:eastAsia="Times New Roman" w:hAnsi="Times New Roman" w:cs="Times New Roman"/>
           <w:noProof/>
-          <w:kern w:val="0"/>
-          <w:lang w:eastAsia="es-MX"/>
-        </w:rPr>
-        <w:pict w14:anchorId="5FD9D49C">
-          <v:rect id="_x0000_i1025" style="width:0;height:1.5pt" o:hralign="center" o:hrstd="t" o:hr="t" fillcolor="#a0a0a0" stroked="f"/>
+        </w:rPr>
+      </w:r>
+      <w:r>
+        <w:pict w14:anchorId="45BCE36F">
+          <v:rect id="Rectángulo 23" o:spid="_x0000_s1026" style="width:441.9pt;height:1.1pt;visibility:visible;mso-wrap-style:square;mso-left-percent:-10001;mso-top-percent:-10001;mso-position-horizontal:absolute;mso-position-horizontal-relative:char;mso-position-vertical:absolute;mso-position-vertical-relative:line;mso-left-percent:-10001;mso-top-percent:-10001;v-text-anchor:top" o:gfxdata="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" filled="f">
+            <o:lock v:ext="edit" aspectratio="t"/>
+            <w10:anchorlock/>
+          </v:rect>
         </w:pict>
       </w:r>
     </w:p>

</xml_diff>